<commit_message>
docs: verify Windows demo workflow and refresh submission report
</commit_message>
<xml_diff>
--- a/report/Freight_Rate_ML_Assessment_Report.docx
+++ b/report/Freight_Rate_ML_Assessment_Report.docx
@@ -16,7 +16,7 @@
           <w:i/>
           <w:sz w:val="18"/>
         </w:rPr>
-        <w:t>Technical report · Executed repository results · 04 October 2026</w:t>
+        <w:t>Technical report · Executed repository results · 06 October 2026</w:t>
       </w:r>
     </w:p>
     <w:p>
@@ -373,7 +373,7 @@
       </w:r>
       <w:r>
         <w:rPr>
-          <w:rFonts w:ascii="DejaVu Sans Mono" w:hAnsi="DejaVu Sans Mono"/>
+          <w:rFonts w:ascii="Consolas" w:hAnsi="Consolas"/>
           <w:sz w:val="18"/>
         </w:rPr>
         <w:t>posted_rate</w:t>
@@ -383,7 +383,7 @@
       </w:r>
       <w:r>
         <w:rPr>
-          <w:rFonts w:ascii="DejaVu Sans Mono" w:hAnsi="DejaVu Sans Mono"/>
+          <w:rFonts w:ascii="Consolas" w:hAnsi="Consolas"/>
           <w:sz w:val="18"/>
         </w:rPr>
         <w:t>load_id</w:t>
@@ -710,7 +710,7 @@
       </w:r>
       <w:r>
         <w:rPr>
-          <w:rFonts w:ascii="DejaVu Sans Mono" w:hAnsi="DejaVu Sans Mono"/>
+          <w:rFonts w:ascii="Consolas" w:hAnsi="Consolas"/>
           <w:sz w:val="18"/>
         </w:rPr>
         <w:t>abs(weight)</w:t>
@@ -761,7 +761,7 @@
       </w:r>
       <w:r>
         <w:rPr>
-          <w:rFonts w:ascii="DejaVu Sans Mono" w:hAnsi="DejaVu Sans Mono"/>
+          <w:rFonts w:ascii="Consolas" w:hAnsi="Consolas"/>
           <w:sz w:val="18"/>
         </w:rPr>
         <w:t>handle_unknown="ignore"</w:t>
@@ -1578,7 +1578,7 @@
       </w:r>
       <w:r>
         <w:rPr>
-          <w:rFonts w:ascii="DejaVu Sans Mono" w:hAnsi="DejaVu Sans Mono"/>
+          <w:rFonts w:ascii="Consolas" w:hAnsi="Consolas"/>
           <w:sz w:val="18"/>
         </w:rPr>
         <w:t>src/features.py</w:t>
@@ -1597,7 +1597,7 @@
       </w:r>
       <w:r>
         <w:rPr>
-          <w:rFonts w:ascii="DejaVu Sans Mono" w:hAnsi="DejaVu Sans Mono"/>
+          <w:rFonts w:ascii="Consolas" w:hAnsi="Consolas"/>
           <w:sz w:val="18"/>
         </w:rPr>
         <w:t>load_id</w:t>
@@ -1607,7 +1607,7 @@
       </w:r>
       <w:r>
         <w:rPr>
-          <w:rFonts w:ascii="DejaVu Sans Mono" w:hAnsi="DejaVu Sans Mono"/>
+          <w:rFonts w:ascii="Consolas" w:hAnsi="Consolas"/>
           <w:sz w:val="18"/>
         </w:rPr>
         <w:t>posted_rate</w:t>
@@ -1617,7 +1617,7 @@
       </w:r>
       <w:r>
         <w:rPr>
-          <w:rFonts w:ascii="DejaVu Sans Mono" w:hAnsi="DejaVu Sans Mono"/>
+          <w:rFonts w:ascii="Consolas" w:hAnsi="Consolas"/>
           <w:sz w:val="18"/>
         </w:rPr>
         <w:t>predicted_rate</w:t>
@@ -1923,7 +1923,7 @@
     <w:p>
       <w:r>
         <w:rPr>
-          <w:rFonts w:ascii="DejaVu Sans Mono" w:hAnsi="DejaVu Sans Mono"/>
+          <w:rFonts w:ascii="Consolas" w:hAnsi="Consolas"/>
           <w:sz w:val="18"/>
         </w:rPr>
         <w:t>weight_clean</w:t>
@@ -1947,7 +1947,7 @@
       </w:r>
       <w:r>
         <w:rPr>
-          <w:rFonts w:ascii="DejaVu Sans Mono" w:hAnsi="DejaVu Sans Mono"/>
+          <w:rFonts w:ascii="Consolas" w:hAnsi="Consolas"/>
           <w:sz w:val="18"/>
         </w:rPr>
         <w:t>docs/validation_plan.md</w:t>
@@ -1957,7 +1957,7 @@
       </w:r>
       <w:r>
         <w:rPr>
-          <w:rFonts w:ascii="DejaVu Sans Mono" w:hAnsi="DejaVu Sans Mono"/>
+          <w:rFonts w:ascii="Consolas" w:hAnsi="Consolas"/>
           <w:sz w:val="18"/>
         </w:rPr>
         <w:t>docs/final_model_config.json</w:t>
@@ -1967,7 +1967,7 @@
       </w:r>
       <w:r>
         <w:rPr>
-          <w:rFonts w:ascii="DejaVu Sans Mono" w:hAnsi="DejaVu Sans Mono"/>
+          <w:rFonts w:ascii="Consolas" w:hAnsi="Consolas"/>
           <w:sz w:val="18"/>
         </w:rPr>
         <w:t>reports/model_comparison.csv</w:t>
@@ -1977,7 +1977,7 @@
       </w:r>
       <w:r>
         <w:rPr>
-          <w:rFonts w:ascii="DejaVu Sans Mono" w:hAnsi="DejaVu Sans Mono"/>
+          <w:rFonts w:ascii="Consolas" w:hAnsi="Consolas"/>
           <w:sz w:val="18"/>
         </w:rPr>
         <w:t>src/features.py</w:t>
@@ -2569,7 +2569,7 @@
       </w:r>
       <w:r>
         <w:rPr>
-          <w:rFonts w:ascii="DejaVu Sans Mono" w:hAnsi="DejaVu Sans Mono"/>
+          <w:rFonts w:ascii="Consolas" w:hAnsi="Consolas"/>
           <w:sz w:val="18"/>
         </w:rPr>
         <w:t>log1p(posted_rate)</w:t>
@@ -2579,7 +2579,7 @@
       </w:r>
       <w:r>
         <w:rPr>
-          <w:rFonts w:ascii="DejaVu Sans Mono" w:hAnsi="DejaVu Sans Mono"/>
+          <w:rFonts w:ascii="Consolas" w:hAnsi="Consolas"/>
           <w:sz w:val="18"/>
         </w:rPr>
         <w:t>expm1</w:t>
@@ -2616,7 +2616,7 @@
       </w:r>
       <w:r>
         <w:rPr>
-          <w:rFonts w:ascii="DejaVu Sans Mono" w:hAnsi="DejaVu Sans Mono"/>
+          <w:rFonts w:ascii="Consolas" w:hAnsi="Consolas"/>
           <w:sz w:val="18"/>
         </w:rPr>
         <w:t>artifacts/</w:t>
@@ -2640,7 +2640,7 @@
       </w:r>
       <w:r>
         <w:rPr>
-          <w:rFonts w:ascii="DejaVu Sans Mono" w:hAnsi="DejaVu Sans Mono"/>
+          <w:rFonts w:ascii="Consolas" w:hAnsi="Consolas"/>
           <w:sz w:val="18"/>
         </w:rPr>
         <w:t>load_id,predicted_rate</w:t>
@@ -3005,7 +3005,7 @@
     </w:p>
     <w:p>
       <w:r>
-        <w:t>Native-model round trips reproduce predictions exactly. The executed production rerun reproduced both CSV hashes exactly. Output summaries are not accuracy metrics.</w:t>
+        <w:t>Saved-model inference after the production run reproduced both CSV hashes exactly. Output summaries are not accuracy metrics.</w:t>
       </w:r>
     </w:p>
     <w:p>
@@ -3045,7 +3045,7 @@
       </w:r>
       <w:r>
         <w:rPr>
-          <w:rFonts w:ascii="DejaVu Sans Mono" w:hAnsi="DejaVu Sans Mono"/>
+          <w:rFonts w:ascii="Consolas" w:hAnsi="Consolas"/>
           <w:sz w:val="18"/>
         </w:rPr>
         <w:t>predicted_rate</w:t>
@@ -3131,7 +3131,7 @@
       </w:r>
       <w:r>
         <w:rPr>
-          <w:rFonts w:ascii="DejaVu Sans Mono" w:hAnsi="DejaVu Sans Mono"/>
+          <w:rFonts w:ascii="Consolas" w:hAnsi="Consolas"/>
           <w:sz w:val="18"/>
         </w:rPr>
         <w:t>score.py</w:t>
@@ -3198,17 +3198,17 @@
     </w:p>
     <w:p>
       <w:r>
-        <w:t xml:space="preserve">Use Python 3.12.14 and the pinned tested versions in </w:t>
+        <w:t xml:space="preserve">Verified with Windows Python 3.12.5 and the pinned versions in </w:t>
       </w:r>
       <w:r>
         <w:rPr>
-          <w:rFonts w:ascii="DejaVu Sans Mono" w:hAnsi="DejaVu Sans Mono"/>
+          <w:rFonts w:ascii="Consolas" w:hAnsi="Consolas"/>
           <w:sz w:val="18"/>
         </w:rPr>
         <w:t>constraints.txt</w:t>
       </w:r>
       <w:r>
-        <w:t>, alongside compatible requirements. From the repository root:</w:t>
+        <w:t>. From the repository root in PowerShell (macOS/Linux commands are in README):</w:t>
       </w:r>
     </w:p>
     <w:p>
@@ -3217,55 +3217,71 @@
       </w:pPr>
       <w:r>
         <w:rPr>
-          <w:rFonts w:ascii="DejaVu Sans Mono" w:hAnsi="DejaVu Sans Mono"/>
+          <w:rFonts w:ascii="Consolas" w:hAnsi="Consolas"/>
           <w:sz w:val="16"/>
         </w:rPr>
-        <w:t>python -m venv .venv</w:t>
+        <w:t>py -3.12 -m venv .venv</w:t>
         <w:br/>
       </w:r>
       <w:r>
         <w:rPr>
-          <w:rFonts w:ascii="DejaVu Sans Mono" w:hAnsi="DejaVu Sans Mono"/>
+          <w:rFonts w:ascii="Consolas" w:hAnsi="Consolas"/>
           <w:sz w:val="16"/>
         </w:rPr>
-        <w:t>source .venv/bin/activate</w:t>
+        <w:t>$env:PYTHONUTF8 = "1"</w:t>
         <w:br/>
       </w:r>
       <w:r>
         <w:rPr>
-          <w:rFonts w:ascii="DejaVu Sans Mono" w:hAnsi="DejaVu Sans Mono"/>
+          <w:rFonts w:ascii="Consolas" w:hAnsi="Consolas"/>
           <w:sz w:val="16"/>
         </w:rPr>
-        <w:t>python -m pip install -r requirements.txt -c constraints.txt</w:t>
+        <w:t>$env:MPLCONFIGDIR = ".cache/matplotlib"</w:t>
         <w:br/>
       </w:r>
       <w:r>
         <w:rPr>
-          <w:rFonts w:ascii="DejaVu Sans Mono" w:hAnsi="DejaVu Sans Mono"/>
+          <w:rFonts w:ascii="Consolas" w:hAnsi="Consolas"/>
           <w:sz w:val="16"/>
         </w:rPr>
-        <w:t>python run_pipeline.py</w:t>
+        <w:t>$python = ".\.venv\Scripts\python.exe"</w:t>
         <w:br/>
       </w:r>
       <w:r>
         <w:rPr>
-          <w:rFonts w:ascii="DejaVu Sans Mono" w:hAnsi="DejaVu Sans Mono"/>
+          <w:rFonts w:ascii="Consolas" w:hAnsi="Consolas"/>
           <w:sz w:val="16"/>
         </w:rPr>
-        <w:t>pytest -q</w:t>
+        <w:t>&amp; $python -m pip install -r requirements.txt -c constraints.txt</w:t>
         <w:br/>
       </w:r>
       <w:r>
         <w:rPr>
-          <w:rFonts w:ascii="DejaVu Sans Mono" w:hAnsi="DejaVu Sans Mono"/>
+          <w:rFonts w:ascii="Consolas" w:hAnsi="Consolas"/>
           <w:sz w:val="16"/>
         </w:rPr>
-        <w:t>python score.py --predictions validation_predictions.csv \</w:t>
+        <w:t>&amp; $python run_pipeline.py</w:t>
         <w:br/>
       </w:r>
       <w:r>
         <w:rPr>
-          <w:rFonts w:ascii="DejaVu Sans Mono" w:hAnsi="DejaVu Sans Mono"/>
+          <w:rFonts w:ascii="Consolas" w:hAnsi="Consolas"/>
+          <w:sz w:val="16"/>
+        </w:rPr>
+        <w:t>&amp; $python -m pytest -q</w:t>
+        <w:br/>
+      </w:r>
+      <w:r>
+        <w:rPr>
+          <w:rFonts w:ascii="Consolas" w:hAnsi="Consolas"/>
+          <w:sz w:val="16"/>
+        </w:rPr>
+        <w:t>&amp; $python score.py --predictions validation_predictions.csv `</w:t>
+        <w:br/>
+      </w:r>
+      <w:r>
+        <w:rPr>
+          <w:rFonts w:ascii="Consolas" w:hAnsi="Consolas"/>
           <w:sz w:val="16"/>
         </w:rPr>
         <w:t xml:space="preserve">  --december-predictions data/december_chart_inputs.csv</w:t>
@@ -3273,10 +3289,10 @@
       </w:r>
       <w:r>
         <w:rPr>
-          <w:rFonts w:ascii="DejaVu Sans Mono" w:hAnsi="DejaVu Sans Mono"/>
+          <w:rFonts w:ascii="Consolas" w:hAnsi="Consolas"/>
           <w:sz w:val="16"/>
         </w:rPr>
-        <w:t>python scripts/build_report.py</w:t>
+        <w:t>&amp; $python scripts/build_report.py</w:t>
         <w:br/>
       </w:r>
     </w:p>
@@ -3288,14 +3304,14 @@
         <w:rPr>
           <w:b/>
         </w:rPr>
-        <w:t>109 tests plus 4 subtests passed</w:t>
+        <w:t>110 tests plus 4 subtests passed</w:t>
       </w:r>
       <w:r>
         <w:t xml:space="preserve">, pipeline passed, original scorer passed. Protected inputs remain unchanged. </w:t>
       </w:r>
       <w:r>
         <w:rPr>
-          <w:rFonts w:ascii="DejaVu Sans Mono" w:hAnsi="DejaVu Sans Mono"/>
+          <w:rFonts w:ascii="Consolas" w:hAnsi="Consolas"/>
           <w:sz w:val="18"/>
         </w:rPr>
         <w:t>README.md</w:t>
@@ -3305,7 +3321,7 @@
       </w:r>
       <w:r>
         <w:rPr>
-          <w:rFonts w:ascii="DejaVu Sans Mono" w:hAnsi="DejaVu Sans Mono"/>
+          <w:rFonts w:ascii="Consolas" w:hAnsi="Consolas"/>
           <w:sz w:val="18"/>
         </w:rPr>
         <w:t>docs/worklog.md</w:t>
@@ -3736,7 +3752,7 @@
       <w:spacing w:after="100" w:line="259" w:lineRule="auto"/>
     </w:pPr>
     <w:rPr>
-      <w:rFonts w:ascii="DejaVu Sans" w:hAnsi="DejaVu Sans"/>
+      <w:rFonts w:ascii="Calibri" w:hAnsi="Calibri"/>
       <w:color w:val="24313A"/>
       <w:sz w:val="20"/>
     </w:rPr>
@@ -3800,7 +3816,7 @@
       <w:outlineLvl w:val="0"/>
     </w:pPr>
     <w:rPr>
-      <w:rFonts w:asciiTheme="majorHAnsi" w:eastAsiaTheme="majorEastAsia" w:hAnsiTheme="majorHAnsi" w:cstheme="majorBidi" w:ascii="DejaVu Sans" w:hAnsi="DejaVu Sans"/>
+      <w:rFonts w:asciiTheme="majorHAnsi" w:eastAsiaTheme="majorEastAsia" w:hAnsiTheme="majorHAnsi" w:cstheme="majorBidi" w:ascii="Calibri" w:hAnsi="Calibri"/>
       <w:b/>
       <w:bCs/>
       <w:color w:val="17384A"/>
@@ -4087,9 +4103,17 @@
       </w:pBdr>
       <w:spacing w:after="80" w:line="240" w:lineRule="auto"/>
       <w:contextualSpacing/>
+      <w:pBdr>
+        <w:top w:val="nil"/>
+        <w:left w:val="nil"/>
+        <w:bottom w:val="nil"/>
+        <w:right w:val="nil"/>
+        <w:between w:val="nil"/>
+        <w:bar w:val="nil"/>
+      </w:pBdr>
     </w:pPr>
     <w:rPr>
-      <w:rFonts w:asciiTheme="majorHAnsi" w:eastAsiaTheme="majorEastAsia" w:hAnsiTheme="majorHAnsi" w:cstheme="majorBidi" w:ascii="DejaVu Sans" w:hAnsi="DejaVu Sans"/>
+      <w:rFonts w:asciiTheme="majorHAnsi" w:eastAsiaTheme="majorEastAsia" w:hAnsiTheme="majorHAnsi" w:cstheme="majorBidi" w:ascii="Calibri" w:hAnsi="Calibri"/>
       <w:color w:val="17384A"/>
       <w:spacing w:val="5"/>
       <w:kern w:val="28"/>

</xml_diff>